<commit_message>
Ajusta Capa e Folha de Rosto com todos os nomes/RAs e alinhamento do orientador conforme Manual PIM IV
</commit_message>
<xml_diff>
--- a/Documentacao_PIM_IV_ABNT_VestindoSonhos.docx
+++ b/Documentacao_PIM_IV_ABNT_VestindoSonhos.docx
@@ -66,7 +66,7 @@
           <w:rFonts w:ascii="Arial" w:hAnsi="Arial" w:cs="Arial"/>
           <w:b/>
         </w:rPr>
-        <w:t>VINICIUS [SOBRENOME DO ALUNO 1] – RA: [0000000]</w:t>
+        <w:t>BIANCA DE FÁTIMA PINA – RA: F366693</w:t>
       </w:r>
     </w:p>
     <w:p>
@@ -79,7 +79,7 @@
           <w:rFonts w:ascii="Arial" w:hAnsi="Arial" w:cs="Arial"/>
           <w:b/>
         </w:rPr>
-        <w:t>[NOME COMPLETO DO ALUNO 2] – RA: [0000000]</w:t>
+        <w:t>FERNANDA LEMES – RA: H70JCJ4</w:t>
       </w:r>
     </w:p>
     <w:p>
@@ -92,7 +92,7 @@
           <w:rFonts w:ascii="Arial" w:hAnsi="Arial" w:cs="Arial"/>
           <w:b/>
         </w:rPr>
-        <w:t>[NOME COMPLETO DO ALUNO 3] – RA: [0000000]</w:t>
+        <w:t>GUSTAVO APOLINÁRIO SOUZA SANTOS – RA: R222430</w:t>
       </w:r>
     </w:p>
     <w:p>
@@ -105,7 +105,7 @@
           <w:rFonts w:ascii="Arial" w:hAnsi="Arial" w:cs="Arial"/>
           <w:b/>
         </w:rPr>
-        <w:t>[NOME COMPLETO DO ALUNO 4] – RA: [0000000]</w:t>
+        <w:t>MONIQUE SANTONE DE MOURA – RA: R155009 / VITOR HUGO CINCERRE ANGELO – RA: H74GID8</w:t>
       </w:r>
     </w:p>
     <w:p>
@@ -181,7 +181,7 @@
           <w:b/>
         </w:rPr>
         <w:lastRenderedPageBreak/>
-        <w:t>VINICIUS [SOBRENOME DO ALUNO 1] – RA: [0000000]</w:t>
+        <w:t>BIANCA DE FÁTIMA PINA – RA: F366693</w:t>
       </w:r>
     </w:p>
     <w:p>
@@ -194,7 +194,7 @@
           <w:rFonts w:ascii="Arial" w:hAnsi="Arial" w:cs="Arial"/>
           <w:b/>
         </w:rPr>
-        <w:t>[NOME COMPLETO DO ALUNO 2] – RA: [0000000]</w:t>
+        <w:t>FERNANDA LEMES – RA: H70JCJ4</w:t>
       </w:r>
     </w:p>
     <w:p>
@@ -207,7 +207,7 @@
           <w:rFonts w:ascii="Arial" w:hAnsi="Arial" w:cs="Arial"/>
           <w:b/>
         </w:rPr>
-        <w:t>[NOME COMPLETO DO ALUNO 3] – RA: [0000000]</w:t>
+        <w:t>GUSTAVO APOLINÁRIO SOUZA SANTOS – RA: R222430</w:t>
       </w:r>
     </w:p>
     <w:p>
@@ -220,7 +220,7 @@
           <w:rFonts w:ascii="Arial" w:hAnsi="Arial" w:cs="Arial"/>
           <w:b/>
         </w:rPr>
-        <w:t>[NOME COMPLETO DO ALUNO 4] – RA: [0000000]</w:t>
+        <w:t>MONIQUE SANTONE DE MOURA – RA: R155009 / VITOR HUGO CINCERRE ANGELO – RA: H74GID8</w:t>
       </w:r>
     </w:p>
     <w:p>

</xml_diff>